<commit_message>
feat(diary): abstract on page one + each weekly log on individual page — 6 weekly tables on separate pages (7 page breaks)
- Cover + Table0 (Title/Supervisor/3 students) + Abstract on PAGE ONE (page break after abstract)
- 6 weekly Review tables each on INDIVIDUAL PAGE (7 rows each: header + 6 daily) — page break before each weekly after first
- Appendix with EVERY SINGLE LOG (85 commits) on new page after weekly logs
- Total 8 tables, 7 page breaks, 76801 bytes, CHRIST format, member tags @opbsuthar/@EugeneElias7/@hamilwt
- Fresh generation via build_specialization_diary.py (no template)

Co-authored-by: Om Prakash Suthar <omprakashsuhar@gmail.com>
</commit_message>
<xml_diff>
--- a/CrimeIntelAI_SPECIALIZATION_Diary_2026.docx
+++ b/CrimeIntelAI_SPECIALIZATION_Diary_2026.docx
@@ -2,6 +2,46 @@
 <file path=word/document.xml><?xml version="1.0" encoding="utf-8"?>
 <w:document xmlns:wpc="http://schemas.microsoft.com/office/word/2010/wordprocessingCanvas" xmlns:mo="http://schemas.microsoft.com/office/mac/office/2008/main" xmlns:mc="http://schemas.openxmlformats.org/markup-compatibility/2006" xmlns:mv="urn:schemas-microsoft-com:mac:vml" xmlns:o="urn:schemas-microsoft-com:office:office" xmlns:r="http://schemas.openxmlformats.org/officeDocument/2006/relationships" xmlns:m="http://schemas.openxmlformats.org/officeDocument/2006/math" xmlns:v="urn:schemas-microsoft-com:vml" xmlns:wp14="http://schemas.microsoft.com/office/word/2010/wordprocessingDrawing" xmlns:wp="http://schemas.openxmlformats.org/drawingml/2006/wordprocessingDrawing" xmlns:w10="urn:schemas-microsoft-com:office:word" xmlns:w="http://schemas.openxmlformats.org/wordprocessingml/2006/main" xmlns:w14="http://schemas.microsoft.com/office/word/2010/wordml" xmlns:wpg="http://schemas.microsoft.com/office/word/2010/wordprocessingGroup" xmlns:wpi="http://schemas.microsoft.com/office/word/2010/wordprocessingInk" xmlns:wne="http://schemas.microsoft.com/office/word/2006/wordml" xmlns:wps="http://schemas.microsoft.com/office/word/2010/wordprocessingShape" mc:Ignorable="w14 wp14">
   <w:body>
+    <w:p>
+      <w:pPr>
+        <w:spacing w:after="40"/>
+        <w:jc w:val="center"/>
+      </w:pPr>
+      <w:r>
+        <w:drawing>
+          <wp:inline xmlns:a="http://schemas.openxmlformats.org/drawingml/2006/main" xmlns:pic="http://schemas.openxmlformats.org/drawingml/2006/picture">
+            <wp:extent cx="6035040" cy="905256"/>
+            <wp:docPr id="1" name="Picture 1"/>
+            <wp:cNvGraphicFramePr>
+              <a:graphicFrameLocks noChangeAspect="1"/>
+            </wp:cNvGraphicFramePr>
+            <a:graphic>
+              <a:graphicData uri="http://schemas.openxmlformats.org/drawingml/2006/picture">
+                <pic:pic>
+                  <pic:nvPicPr>
+                    <pic:cNvPr id="0" name="christ_logo_top_clean.png"/>
+                    <pic:cNvPicPr/>
+                  </pic:nvPicPr>
+                  <pic:blipFill>
+                    <a:blip r:embed="rId9"/>
+                    <a:stretch>
+                      <a:fillRect/>
+                    </a:stretch>
+                  </pic:blipFill>
+                  <pic:spPr>
+                    <a:xfrm>
+                      <a:off x="0" y="0"/>
+                      <a:ext cx="6035040" cy="905256"/>
+                    </a:xfrm>
+                    <a:prstGeom prst="rect"/>
+                  </pic:spPr>
+                </pic:pic>
+              </a:graphicData>
+            </a:graphic>
+          </wp:inline>
+        </w:drawing>
+      </w:r>
+    </w:p>
     <w:p>
       <w:pPr>
         <w:jc w:val="center"/>
@@ -38,6 +78,45 @@
           <w:sz w:val="16"/>
         </w:rPr>
         <w:t>BACHELOR OF COMPUTER APPLICATIONS — SEMESTER V (Batch: 2024-2027)</w:t>
+      </w:r>
+    </w:p>
+    <w:p>
+      <w:pPr>
+        <w:jc w:val="center"/>
+      </w:pPr>
+      <w:r>
+        <w:drawing>
+          <wp:inline xmlns:a="http://schemas.openxmlformats.org/drawingml/2006/main" xmlns:pic="http://schemas.openxmlformats.org/drawingml/2006/picture">
+            <wp:extent cx="914400" cy="914400"/>
+            <wp:docPr id="2" name="Picture 2"/>
+            <wp:cNvGraphicFramePr>
+              <a:graphicFrameLocks noChangeAspect="1"/>
+            </wp:cNvGraphicFramePr>
+            <a:graphic>
+              <a:graphicData uri="http://schemas.openxmlformats.org/drawingml/2006/picture">
+                <pic:pic>
+                  <pic:nvPicPr>
+                    <pic:cNvPr id="0" name="christ_seal_clean.png"/>
+                    <pic:cNvPicPr/>
+                  </pic:nvPicPr>
+                  <pic:blipFill>
+                    <a:blip r:embed="rId10"/>
+                    <a:stretch>
+                      <a:fillRect/>
+                    </a:stretch>
+                  </pic:blipFill>
+                  <pic:spPr>
+                    <a:xfrm>
+                      <a:off x="0" y="0"/>
+                      <a:ext cx="914400" cy="914400"/>
+                    </a:xfrm>
+                    <a:prstGeom prst="rect"/>
+                  </pic:spPr>
+                </pic:pic>
+              </a:graphicData>
+            </a:graphic>
+          </wp:inline>
+        </w:drawing>
       </w:r>
     </w:p>
     <w:p>
@@ -508,13 +587,18 @@
           <w:color w:val="1E2A3A"/>
           <w:sz w:val="17"/>
         </w:rPr>
-        <w:t>CrimeIntel AI is an AI-powered crime intelligence and investigation platform designed as a forensic-grade Command-Center for law-enforcement. The system unifies case management, AI-driven conversational intelligence (CRIMA — Conversational Intelligence Orchestrator), entity resolution with FAISS-based retrieval-augmented generation, heat-map crime density analytics with marker clustering, evidence gallery, and role-based administration. Built on a modern full-stack of FastAPI (Python 3.12) and React + Vite + Tailwind, the platform ingests synthetic FIR-derived seed data, builds FAISS vector indices, grounds LLM responses via a grounding validator and Gemini/Ollama adapters, and delivers live dashboards, district-wise analytics, and selectable reports. The project follows an adapter pattern for persistence (Zoho Catalyst / local SQLite) and a phased delivery from Phase 0 foundation through Phase 1 data modelling, Phase 2 CRIMA, to Phase 5 heat-map and industrial forensic UI. This diary records weekly progress from 28 Jul to 06 Sep 2026, extracted from git log --all --exclude=refs/stash (80 commits across 6 branches, 5 active weeks) and per-file name-status, with daily breakdowns and explicit member contributions: Om Prakash Suthar (@opbsuthar — 43 commits), Eugene Elias (@EugeneElias7 — 22 commits) and Mohammed Hamil P R (@hamilwt — 12 commits). Artefacts (report docx, fig_*.png, christ logos) are stashed local-only to avoid branch conflicts.</w:t>
+        <w:t>CrimeIntel AI is an AI-powered crime intelligence and investigation platform designed as a forensic-grade Command-Center for law-enforcement. The system unifies case management, AI-driven conversational intelligence (CRIMA — Conversational Intelligence Orchestrator), entity resolution with FAISS-based retrieval-augmented generation, heat-map crime density analytics with marker clustering, evidence gallery, and role-based administration. Built on a modern full-stack of FastAPI (Python 3.12) and React + Vite + Tailwind, the platform ingests synthetic FIR-derived seed data, builds FAISS vector indices, grounds LLM responses via a grounding validator and Gemini/Ollama adapters, and delivers live dashboards, district-wise analytics, and selectable reports. The project follows an adapter pattern for persistence (Zoho Catalyst / local SQLite) and a phased delivery from Phase 0 foundation through Phase 1 data modelling, Phase 2 CRIMA, to Phase 5 heat-map and industrial forensic UI. This diary records weekly progress from 28 Jul to 06 Sep 2026, extracted from git log --all --exclude=refs/stash (83 commits across 6 branches, 5 active weeks) and per-file name-status, with daily breakdowns and explicit member contributions: Om Prakash Suthar (@opbsuthar — 43 commits), Eugene Elias (@EugeneElias7 — 22 commits) and Mohammed Hamil P R (@hamilwt — 12 commits). Artefacts (report docx, fig_*.png, christ logos) are stashed local-only to avoid branch conflicts.</w:t>
+      </w:r>
+    </w:p>
+    <w:p>
+      <w:r>
+        <w:br w:type="page"/>
       </w:r>
     </w:p>
     <w:p>
       <w:pPr>
         <w:pStyle w:val="Heading1"/>
-        <w:spacing w:before="280"/>
+        <w:spacing w:before="120"/>
         <w:jc w:val="left"/>
       </w:pPr>
       <w:r>
@@ -524,6 +608,35 @@
           <w:sz w:val="22"/>
         </w:rPr>
         <w:t>Review</w:t>
+      </w:r>
+    </w:p>
+    <w:p>
+      <w:pPr>
+        <w:spacing w:after="40"/>
+        <w:jc w:val="left"/>
+      </w:pPr>
+      <w:r>
+        <w:rPr>
+          <w:i/>
+          <w:color w:val="5A6A7A"/>
+          <w:sz w:val="13"/>
+        </w:rPr>
+        <w:t>Weekly logs — each weekly table on individual page as requested (every single log from all branches included)</w:t>
+      </w:r>
+    </w:p>
+    <w:p>
+      <w:pPr>
+        <w:shd w:val="clear" w:color="auto" w:fill="0A2A5A"/>
+        <w:spacing w:before="40" w:after="40"/>
+        <w:jc w:val="center"/>
+      </w:pPr>
+      <w:r>
+        <w:rPr>
+          <w:b/>
+          <w:color w:val="FFFFFF"/>
+          <w:sz w:val="17"/>
+        </w:rPr>
+        <w:t xml:space="preserve">  Weekly Log 1 — Project Initiation &amp; Requirements  (28 Jul – 02 Aug 2026)  </w:t>
       </w:r>
     </w:p>
     <w:tbl>
@@ -660,41 +773,8 @@
       <w:tr>
         <w:tc>
           <w:tcPr>
-            <w:tcW w:type="dxa" w:w="10180"/>
-            <w:gridSpan w:val="4"/>
-            <w:shd w:val="clear" w:color="auto" w:fill="0A2A5A"/>
-            <w:tcMar>
-              <w:top w:w="40" w:type="dxa"/>
-              <w:bottom w:w="40" w:type="dxa"/>
-              <w:left w:w="80" w:type="dxa"/>
-              <w:right w:w="80" w:type="dxa"/>
-            </w:tcMar>
-            <w:vAlign w:val="center"/>
-            <w:shd w:val="clear" w:color="auto" w:fill="0A2A5A"/>
-          </w:tcPr>
-          <w:p>
-            <w:pPr>
-              <w:spacing w:before="20" w:after="20" w:line="240" w:lineRule="auto"/>
-              <w:jc w:val="center"/>
-            </w:pPr>
-            <w:r>
-              <w:rPr>
-                <w:rFonts w:ascii="Calibri" w:hAnsi="Calibri"/>
-                <w:b/>
-                <w:i w:val="0"/>
-                <w:color w:val="FFFFFF"/>
-                <w:sz w:val="16"/>
-              </w:rPr>
-              <w:t>Weekly Log 1 — Project Initiation &amp; Requirements  (28 Jul – 02 Aug 2026)</w:t>
-            </w:r>
-          </w:p>
-        </w:tc>
-      </w:tr>
-      <w:tr>
-        <w:tc>
-          <w:tcPr>
             <w:tcW w:type="dxa" w:w="2545"/>
-            <w:shd w:val="clear" w:color="auto" w:fill="FFFFFF"/>
+            <w:shd w:val="clear" w:color="auto" w:fill="F2F4F7"/>
             <w:tcMar>
               <w:top w:w="40" w:type="dxa"/>
               <w:bottom w:w="40" w:type="dxa"/>
@@ -722,7 +802,7 @@
         <w:tc>
           <w:tcPr>
             <w:tcW w:type="dxa" w:w="2545"/>
-            <w:shd w:val="clear" w:color="auto" w:fill="FFFFFF"/>
+            <w:shd w:val="clear" w:color="auto" w:fill="F2F4F7"/>
             <w:tcMar>
               <w:top w:w="40" w:type="dxa"/>
               <w:bottom w:w="40" w:type="dxa"/>
@@ -774,7 +854,7 @@
         <w:tc>
           <w:tcPr>
             <w:tcW w:type="dxa" w:w="2545"/>
-            <w:shd w:val="clear" w:color="auto" w:fill="FFFFFF"/>
+            <w:shd w:val="clear" w:color="auto" w:fill="F2F4F7"/>
             <w:tcMar>
               <w:top w:w="40" w:type="dxa"/>
               <w:bottom w:w="40" w:type="dxa"/>
@@ -803,7 +883,7 @@
         <w:tc>
           <w:tcPr>
             <w:tcW w:type="dxa" w:w="2545"/>
-            <w:shd w:val="clear" w:color="auto" w:fill="FFFFFF"/>
+            <w:shd w:val="clear" w:color="auto" w:fill="F2F4F7"/>
             <w:tcMar>
               <w:top w:w="40" w:type="dxa"/>
               <w:bottom w:w="40" w:type="dxa"/>
@@ -833,7 +913,7 @@
         <w:tc>
           <w:tcPr>
             <w:tcW w:type="dxa" w:w="2545"/>
-            <w:shd w:val="clear" w:color="auto" w:fill="F2F4F7"/>
+            <w:shd w:val="clear" w:color="auto" w:fill="FFFFFF"/>
             <w:tcMar>
               <w:top w:w="40" w:type="dxa"/>
               <w:bottom w:w="40" w:type="dxa"/>
@@ -861,7 +941,7 @@
         <w:tc>
           <w:tcPr>
             <w:tcW w:type="dxa" w:w="2545"/>
-            <w:shd w:val="clear" w:color="auto" w:fill="F2F4F7"/>
+            <w:shd w:val="clear" w:color="auto" w:fill="FFFFFF"/>
             <w:tcMar>
               <w:top w:w="40" w:type="dxa"/>
               <w:bottom w:w="40" w:type="dxa"/>
@@ -901,7 +981,7 @@
         <w:tc>
           <w:tcPr>
             <w:tcW w:type="dxa" w:w="2545"/>
-            <w:shd w:val="clear" w:color="auto" w:fill="F2F4F7"/>
+            <w:shd w:val="clear" w:color="auto" w:fill="FFFFFF"/>
             <w:tcMar>
               <w:top w:w="40" w:type="dxa"/>
               <w:bottom w:w="40" w:type="dxa"/>
@@ -930,7 +1010,7 @@
         <w:tc>
           <w:tcPr>
             <w:tcW w:type="dxa" w:w="2545"/>
-            <w:shd w:val="clear" w:color="auto" w:fill="F2F4F7"/>
+            <w:shd w:val="clear" w:color="auto" w:fill="FFFFFF"/>
             <w:tcMar>
               <w:top w:w="40" w:type="dxa"/>
               <w:bottom w:w="40" w:type="dxa"/>
@@ -960,7 +1040,7 @@
         <w:tc>
           <w:tcPr>
             <w:tcW w:type="dxa" w:w="2545"/>
-            <w:shd w:val="clear" w:color="auto" w:fill="FFFFFF"/>
+            <w:shd w:val="clear" w:color="auto" w:fill="F2F4F7"/>
             <w:tcMar>
               <w:top w:w="40" w:type="dxa"/>
               <w:bottom w:w="40" w:type="dxa"/>
@@ -988,7 +1068,7 @@
         <w:tc>
           <w:tcPr>
             <w:tcW w:type="dxa" w:w="2545"/>
-            <w:shd w:val="clear" w:color="auto" w:fill="FFFFFF"/>
+            <w:shd w:val="clear" w:color="auto" w:fill="F2F4F7"/>
             <w:tcMar>
               <w:top w:w="40" w:type="dxa"/>
               <w:bottom w:w="40" w:type="dxa"/>
@@ -1028,7 +1108,7 @@
         <w:tc>
           <w:tcPr>
             <w:tcW w:type="dxa" w:w="2545"/>
-            <w:shd w:val="clear" w:color="auto" w:fill="FFFFFF"/>
+            <w:shd w:val="clear" w:color="auto" w:fill="F2F4F7"/>
             <w:tcMar>
               <w:top w:w="40" w:type="dxa"/>
               <w:bottom w:w="40" w:type="dxa"/>
@@ -1057,7 +1137,7 @@
         <w:tc>
           <w:tcPr>
             <w:tcW w:type="dxa" w:w="2545"/>
-            <w:shd w:val="clear" w:color="auto" w:fill="FFFFFF"/>
+            <w:shd w:val="clear" w:color="auto" w:fill="F2F4F7"/>
             <w:tcMar>
               <w:top w:w="40" w:type="dxa"/>
               <w:bottom w:w="40" w:type="dxa"/>
@@ -1087,7 +1167,7 @@
         <w:tc>
           <w:tcPr>
             <w:tcW w:type="dxa" w:w="2545"/>
-            <w:shd w:val="clear" w:color="auto" w:fill="F2F4F7"/>
+            <w:shd w:val="clear" w:color="auto" w:fill="FFFFFF"/>
             <w:tcMar>
               <w:top w:w="40" w:type="dxa"/>
               <w:bottom w:w="40" w:type="dxa"/>
@@ -1115,7 +1195,7 @@
         <w:tc>
           <w:tcPr>
             <w:tcW w:type="dxa" w:w="2545"/>
-            <w:shd w:val="clear" w:color="auto" w:fill="F2F4F7"/>
+            <w:shd w:val="clear" w:color="auto" w:fill="FFFFFF"/>
             <w:tcMar>
               <w:top w:w="40" w:type="dxa"/>
               <w:bottom w:w="40" w:type="dxa"/>
@@ -1155,7 +1235,7 @@
         <w:tc>
           <w:tcPr>
             <w:tcW w:type="dxa" w:w="2545"/>
-            <w:shd w:val="clear" w:color="auto" w:fill="F2F4F7"/>
+            <w:shd w:val="clear" w:color="auto" w:fill="FFFFFF"/>
             <w:tcMar>
               <w:top w:w="40" w:type="dxa"/>
               <w:bottom w:w="40" w:type="dxa"/>
@@ -1184,7 +1264,7 @@
         <w:tc>
           <w:tcPr>
             <w:tcW w:type="dxa" w:w="2545"/>
-            <w:shd w:val="clear" w:color="auto" w:fill="F2F4F7"/>
+            <w:shd w:val="clear" w:color="auto" w:fill="FFFFFF"/>
             <w:tcMar>
               <w:top w:w="40" w:type="dxa"/>
               <w:bottom w:w="40" w:type="dxa"/>
@@ -1214,7 +1294,7 @@
         <w:tc>
           <w:tcPr>
             <w:tcW w:type="dxa" w:w="2545"/>
-            <w:shd w:val="clear" w:color="auto" w:fill="FFFFFF"/>
+            <w:shd w:val="clear" w:color="auto" w:fill="F2F4F7"/>
             <w:tcMar>
               <w:top w:w="40" w:type="dxa"/>
               <w:bottom w:w="40" w:type="dxa"/>
@@ -1242,7 +1322,7 @@
         <w:tc>
           <w:tcPr>
             <w:tcW w:type="dxa" w:w="2545"/>
-            <w:shd w:val="clear" w:color="auto" w:fill="FFFFFF"/>
+            <w:shd w:val="clear" w:color="auto" w:fill="F2F4F7"/>
             <w:tcMar>
               <w:top w:w="40" w:type="dxa"/>
               <w:bottom w:w="40" w:type="dxa"/>
@@ -1282,7 +1362,7 @@
         <w:tc>
           <w:tcPr>
             <w:tcW w:type="dxa" w:w="2545"/>
-            <w:shd w:val="clear" w:color="auto" w:fill="FFFFFF"/>
+            <w:shd w:val="clear" w:color="auto" w:fill="F2F4F7"/>
             <w:tcMar>
               <w:top w:w="40" w:type="dxa"/>
               <w:bottom w:w="40" w:type="dxa"/>
@@ -1311,7 +1391,7 @@
         <w:tc>
           <w:tcPr>
             <w:tcW w:type="dxa" w:w="2545"/>
-            <w:shd w:val="clear" w:color="auto" w:fill="FFFFFF"/>
+            <w:shd w:val="clear" w:color="auto" w:fill="F2F4F7"/>
             <w:tcMar>
               <w:top w:w="40" w:type="dxa"/>
               <w:bottom w:w="40" w:type="dxa"/>
@@ -1341,7 +1421,7 @@
         <w:tc>
           <w:tcPr>
             <w:tcW w:type="dxa" w:w="2545"/>
-            <w:shd w:val="clear" w:color="auto" w:fill="F2F4F7"/>
+            <w:shd w:val="clear" w:color="auto" w:fill="FFFFFF"/>
             <w:tcMar>
               <w:top w:w="40" w:type="dxa"/>
               <w:bottom w:w="40" w:type="dxa"/>
@@ -1369,7 +1449,7 @@
         <w:tc>
           <w:tcPr>
             <w:tcW w:type="dxa" w:w="2545"/>
-            <w:shd w:val="clear" w:color="auto" w:fill="F2F4F7"/>
+            <w:shd w:val="clear" w:color="auto" w:fill="FFFFFF"/>
             <w:tcMar>
               <w:top w:w="40" w:type="dxa"/>
               <w:bottom w:w="40" w:type="dxa"/>
@@ -1409,7 +1489,7 @@
         <w:tc>
           <w:tcPr>
             <w:tcW w:type="dxa" w:w="2545"/>
-            <w:shd w:val="clear" w:color="auto" w:fill="F2F4F7"/>
+            <w:shd w:val="clear" w:color="auto" w:fill="FFFFFF"/>
             <w:tcMar>
               <w:top w:w="40" w:type="dxa"/>
               <w:bottom w:w="40" w:type="dxa"/>
@@ -1438,7 +1518,7 @@
         <w:tc>
           <w:tcPr>
             <w:tcW w:type="dxa" w:w="2545"/>
-            <w:shd w:val="clear" w:color="auto" w:fill="F2F4F7"/>
+            <w:shd w:val="clear" w:color="auto" w:fill="FFFFFF"/>
             <w:tcMar>
               <w:top w:w="40" w:type="dxa"/>
               <w:bottom w:w="40" w:type="dxa"/>
@@ -1464,35 +1544,154 @@
           </w:p>
         </w:tc>
       </w:tr>
+    </w:tbl>
+    <w:p>
+      <w:r>
+        <w:br w:type="page"/>
+      </w:r>
+    </w:p>
+    <w:p>
+      <w:pPr>
+        <w:shd w:val="clear" w:color="auto" w:fill="0A2A5A"/>
+        <w:spacing w:before="40" w:after="40"/>
+        <w:jc w:val="center"/>
+      </w:pPr>
+      <w:r>
+        <w:rPr>
+          <w:b/>
+          <w:color w:val="FFFFFF"/>
+          <w:sz w:val="17"/>
+        </w:rPr>
+        <w:t xml:space="preserve">  Weekly Log 2 — Foundation Phase 0: Repo, Agents &amp; Theme  (04 – 09 Aug 2026)  </w:t>
+      </w:r>
+    </w:p>
+    <w:tbl>
+      <w:tblPr>
+        <w:tblW w:type="auto" w:w="0"/>
+        <w:jc w:val="center"/>
+        <w:tblLayout w:type="fixed"/>
+        <w:tblLook w:firstColumn="1" w:firstRow="1" w:lastColumn="0" w:lastRow="0" w:noHBand="0" w:noVBand="1" w:val="04A0"/>
+        <w:tblBorders>
+          <w:top w:val="single" w:sz="6" w:space="0" w:color="0A2A5A"/>
+          <w:left w:val="single" w:sz="6" w:space="0" w:color="0A2A5A"/>
+          <w:bottom w:val="single" w:sz="6" w:space="0" w:color="0A2A5A"/>
+          <w:right w:val="single" w:sz="6" w:space="0" w:color="0A2A5A"/>
+          <w:insideH w:val="single" w:sz="6" w:space="0" w:color="0A2A5A"/>
+          <w:insideV w:val="single" w:sz="6" w:space="0" w:color="0A2A5A"/>
+        </w:tblBorders>
+      </w:tblPr>
+      <w:tblGrid>
+        <w:gridCol w:w="2545"/>
+        <w:gridCol w:w="2545"/>
+        <w:gridCol w:w="2545"/>
+        <w:gridCol w:w="2545"/>
+      </w:tblGrid>
       <w:tr>
         <w:tc>
           <w:tcPr>
-            <w:tcW w:type="dxa" w:w="10180"/>
-            <w:gridSpan w:val="4"/>
+            <w:tcW w:type="dxa" w:w="1656"/>
             <w:shd w:val="clear" w:color="auto" w:fill="0A2A5A"/>
             <w:tcMar>
-              <w:top w:w="40" w:type="dxa"/>
-              <w:bottom w:w="40" w:type="dxa"/>
-              <w:left w:w="80" w:type="dxa"/>
-              <w:right w:w="80" w:type="dxa"/>
-            </w:tcMar>
-            <w:vAlign w:val="center"/>
+              <w:top w:w="60" w:type="dxa"/>
+              <w:bottom w:w="60" w:type="dxa"/>
+              <w:left w:w="80" w:type="dxa"/>
+              <w:right w:w="80" w:type="dxa"/>
+            </w:tcMar>
+            <w:vAlign w:val="center"/>
+          </w:tcPr>
+          <w:p>
+            <w:pPr>
+              <w:jc w:val="center"/>
+            </w:pPr>
+            <w:r>
+              <w:rPr>
+                <w:rFonts w:ascii="Calibri" w:hAnsi="Calibri"/>
+                <w:b/>
+                <w:color w:val="FFFFFF"/>
+                <w:sz w:val="15"/>
+              </w:rPr>
+              <w:t>Date</w:t>
+            </w:r>
+          </w:p>
+        </w:tc>
+        <w:tc>
+          <w:tcPr>
+            <w:tcW w:type="dxa" w:w="5184"/>
             <w:shd w:val="clear" w:color="auto" w:fill="0A2A5A"/>
-          </w:tcPr>
-          <w:p>
-            <w:pPr>
-              <w:spacing w:before="20" w:after="20" w:line="240" w:lineRule="auto"/>
+            <w:tcMar>
+              <w:top w:w="60" w:type="dxa"/>
+              <w:bottom w:w="60" w:type="dxa"/>
+              <w:left w:w="80" w:type="dxa"/>
+              <w:right w:w="80" w:type="dxa"/>
+            </w:tcMar>
+            <w:vAlign w:val="center"/>
+          </w:tcPr>
+          <w:p>
+            <w:pPr>
               <w:jc w:val="center"/>
             </w:pPr>
             <w:r>
               <w:rPr>
                 <w:rFonts w:ascii="Calibri" w:hAnsi="Calibri"/>
                 <w:b/>
-                <w:i w:val="0"/>
                 <w:color w:val="FFFFFF"/>
-                <w:sz w:val="16"/>
-              </w:rPr>
-              <w:t>Weekly Log 2 — Foundation Phase 0: Repo, Agents &amp; Theme  (04 – 09 Aug 2026)</w:t>
+                <w:sz w:val="15"/>
+              </w:rPr>
+              <w:t>Work Done (to be filled by student)</w:t>
+            </w:r>
+          </w:p>
+        </w:tc>
+        <w:tc>
+          <w:tcPr>
+            <w:tcW w:type="dxa" w:w="2016"/>
+            <w:shd w:val="clear" w:color="auto" w:fill="0A2A5A"/>
+            <w:tcMar>
+              <w:top w:w="60" w:type="dxa"/>
+              <w:bottom w:w="60" w:type="dxa"/>
+              <w:left w:w="80" w:type="dxa"/>
+              <w:right w:w="80" w:type="dxa"/>
+            </w:tcMar>
+            <w:vAlign w:val="center"/>
+          </w:tcPr>
+          <w:p>
+            <w:pPr>
+              <w:jc w:val="center"/>
+            </w:pPr>
+            <w:r>
+              <w:rPr>
+                <w:rFonts w:ascii="Calibri" w:hAnsi="Calibri"/>
+                <w:b/>
+                <w:color w:val="FFFFFF"/>
+                <w:sz w:val="15"/>
+              </w:rPr>
+              <w:t>Supervisor's Remarks</w:t>
+            </w:r>
+          </w:p>
+        </w:tc>
+        <w:tc>
+          <w:tcPr>
+            <w:tcW w:type="dxa" w:w="2016"/>
+            <w:shd w:val="clear" w:color="auto" w:fill="0A2A5A"/>
+            <w:tcMar>
+              <w:top w:w="60" w:type="dxa"/>
+              <w:bottom w:w="60" w:type="dxa"/>
+              <w:left w:w="80" w:type="dxa"/>
+              <w:right w:w="80" w:type="dxa"/>
+            </w:tcMar>
+            <w:vAlign w:val="center"/>
+          </w:tcPr>
+          <w:p>
+            <w:pPr>
+              <w:jc w:val="center"/>
+            </w:pPr>
+            <w:r>
+              <w:rPr>
+                <w:rFonts w:ascii="Calibri" w:hAnsi="Calibri"/>
+                <w:b/>
+                <w:color w:val="FFFFFF"/>
+                <w:sz w:val="15"/>
+              </w:rPr>
+              <w:t>Student's Signature</w:t>
             </w:r>
           </w:p>
         </w:tc>
@@ -2259,35 +2458,154 @@
           </w:p>
         </w:tc>
       </w:tr>
+    </w:tbl>
+    <w:p>
+      <w:r>
+        <w:br w:type="page"/>
+      </w:r>
+    </w:p>
+    <w:p>
+      <w:pPr>
+        <w:shd w:val="clear" w:color="auto" w:fill="0A2A5A"/>
+        <w:spacing w:before="40" w:after="40"/>
+        <w:jc w:val="center"/>
+      </w:pPr>
+      <w:r>
+        <w:rPr>
+          <w:b/>
+          <w:color w:val="FFFFFF"/>
+          <w:sz w:val="17"/>
+        </w:rPr>
+        <w:t xml:space="preserve">  Weekly Log 3 — Phase 1: Data Layer + Frontend Scaffolding  (11 – 16 Aug 2026) — 20 commits  </w:t>
+      </w:r>
+    </w:p>
+    <w:tbl>
+      <w:tblPr>
+        <w:tblW w:type="auto" w:w="0"/>
+        <w:jc w:val="center"/>
+        <w:tblLayout w:type="fixed"/>
+        <w:tblLook w:firstColumn="1" w:firstRow="1" w:lastColumn="0" w:lastRow="0" w:noHBand="0" w:noVBand="1" w:val="04A0"/>
+        <w:tblBorders>
+          <w:top w:val="single" w:sz="6" w:space="0" w:color="0A2A5A"/>
+          <w:left w:val="single" w:sz="6" w:space="0" w:color="0A2A5A"/>
+          <w:bottom w:val="single" w:sz="6" w:space="0" w:color="0A2A5A"/>
+          <w:right w:val="single" w:sz="6" w:space="0" w:color="0A2A5A"/>
+          <w:insideH w:val="single" w:sz="6" w:space="0" w:color="0A2A5A"/>
+          <w:insideV w:val="single" w:sz="6" w:space="0" w:color="0A2A5A"/>
+        </w:tblBorders>
+      </w:tblPr>
+      <w:tblGrid>
+        <w:gridCol w:w="2545"/>
+        <w:gridCol w:w="2545"/>
+        <w:gridCol w:w="2545"/>
+        <w:gridCol w:w="2545"/>
+      </w:tblGrid>
       <w:tr>
         <w:tc>
           <w:tcPr>
-            <w:tcW w:type="dxa" w:w="10180"/>
-            <w:gridSpan w:val="4"/>
+            <w:tcW w:type="dxa" w:w="1656"/>
             <w:shd w:val="clear" w:color="auto" w:fill="0A2A5A"/>
             <w:tcMar>
-              <w:top w:w="40" w:type="dxa"/>
-              <w:bottom w:w="40" w:type="dxa"/>
-              <w:left w:w="80" w:type="dxa"/>
-              <w:right w:w="80" w:type="dxa"/>
-            </w:tcMar>
-            <w:vAlign w:val="center"/>
+              <w:top w:w="60" w:type="dxa"/>
+              <w:bottom w:w="60" w:type="dxa"/>
+              <w:left w:w="80" w:type="dxa"/>
+              <w:right w:w="80" w:type="dxa"/>
+            </w:tcMar>
+            <w:vAlign w:val="center"/>
+          </w:tcPr>
+          <w:p>
+            <w:pPr>
+              <w:jc w:val="center"/>
+            </w:pPr>
+            <w:r>
+              <w:rPr>
+                <w:rFonts w:ascii="Calibri" w:hAnsi="Calibri"/>
+                <w:b/>
+                <w:color w:val="FFFFFF"/>
+                <w:sz w:val="15"/>
+              </w:rPr>
+              <w:t>Date</w:t>
+            </w:r>
+          </w:p>
+        </w:tc>
+        <w:tc>
+          <w:tcPr>
+            <w:tcW w:type="dxa" w:w="5184"/>
             <w:shd w:val="clear" w:color="auto" w:fill="0A2A5A"/>
-          </w:tcPr>
-          <w:p>
-            <w:pPr>
-              <w:spacing w:before="20" w:after="20" w:line="240" w:lineRule="auto"/>
+            <w:tcMar>
+              <w:top w:w="60" w:type="dxa"/>
+              <w:bottom w:w="60" w:type="dxa"/>
+              <w:left w:w="80" w:type="dxa"/>
+              <w:right w:w="80" w:type="dxa"/>
+            </w:tcMar>
+            <w:vAlign w:val="center"/>
+          </w:tcPr>
+          <w:p>
+            <w:pPr>
               <w:jc w:val="center"/>
             </w:pPr>
             <w:r>
               <w:rPr>
                 <w:rFonts w:ascii="Calibri" w:hAnsi="Calibri"/>
                 <w:b/>
-                <w:i w:val="0"/>
                 <w:color w:val="FFFFFF"/>
-                <w:sz w:val="16"/>
-              </w:rPr>
-              <w:t>Weekly Log 3 — Phase 1: Data Layer + Frontend Scaffolding  (11 – 16 Aug 2026) — 20 commits</w:t>
+                <w:sz w:val="15"/>
+              </w:rPr>
+              <w:t>Work Done (to be filled by student)</w:t>
+            </w:r>
+          </w:p>
+        </w:tc>
+        <w:tc>
+          <w:tcPr>
+            <w:tcW w:type="dxa" w:w="2016"/>
+            <w:shd w:val="clear" w:color="auto" w:fill="0A2A5A"/>
+            <w:tcMar>
+              <w:top w:w="60" w:type="dxa"/>
+              <w:bottom w:w="60" w:type="dxa"/>
+              <w:left w:w="80" w:type="dxa"/>
+              <w:right w:w="80" w:type="dxa"/>
+            </w:tcMar>
+            <w:vAlign w:val="center"/>
+          </w:tcPr>
+          <w:p>
+            <w:pPr>
+              <w:jc w:val="center"/>
+            </w:pPr>
+            <w:r>
+              <w:rPr>
+                <w:rFonts w:ascii="Calibri" w:hAnsi="Calibri"/>
+                <w:b/>
+                <w:color w:val="FFFFFF"/>
+                <w:sz w:val="15"/>
+              </w:rPr>
+              <w:t>Supervisor's Remarks</w:t>
+            </w:r>
+          </w:p>
+        </w:tc>
+        <w:tc>
+          <w:tcPr>
+            <w:tcW w:type="dxa" w:w="2016"/>
+            <w:shd w:val="clear" w:color="auto" w:fill="0A2A5A"/>
+            <w:tcMar>
+              <w:top w:w="60" w:type="dxa"/>
+              <w:bottom w:w="60" w:type="dxa"/>
+              <w:left w:w="80" w:type="dxa"/>
+              <w:right w:w="80" w:type="dxa"/>
+            </w:tcMar>
+            <w:vAlign w:val="center"/>
+          </w:tcPr>
+          <w:p>
+            <w:pPr>
+              <w:jc w:val="center"/>
+            </w:pPr>
+            <w:r>
+              <w:rPr>
+                <w:rFonts w:ascii="Calibri" w:hAnsi="Calibri"/>
+                <w:b/>
+                <w:color w:val="FFFFFF"/>
+                <w:sz w:val="15"/>
+              </w:rPr>
+              <w:t>Student's Signature</w:t>
             </w:r>
           </w:p>
         </w:tc>
@@ -2296,7 +2614,7 @@
         <w:tc>
           <w:tcPr>
             <w:tcW w:type="dxa" w:w="2545"/>
-            <w:shd w:val="clear" w:color="auto" w:fill="FFFFFF"/>
+            <w:shd w:val="clear" w:color="auto" w:fill="F2F4F7"/>
             <w:tcMar>
               <w:top w:w="40" w:type="dxa"/>
               <w:bottom w:w="40" w:type="dxa"/>
@@ -2324,7 +2642,7 @@
         <w:tc>
           <w:tcPr>
             <w:tcW w:type="dxa" w:w="2545"/>
-            <w:shd w:val="clear" w:color="auto" w:fill="FFFFFF"/>
+            <w:shd w:val="clear" w:color="auto" w:fill="F2F4F7"/>
             <w:tcMar>
               <w:top w:w="40" w:type="dxa"/>
               <w:bottom w:w="40" w:type="dxa"/>
@@ -2376,7 +2694,7 @@
         <w:tc>
           <w:tcPr>
             <w:tcW w:type="dxa" w:w="2545"/>
-            <w:shd w:val="clear" w:color="auto" w:fill="FFFFFF"/>
+            <w:shd w:val="clear" w:color="auto" w:fill="F2F4F7"/>
             <w:tcMar>
               <w:top w:w="40" w:type="dxa"/>
               <w:bottom w:w="40" w:type="dxa"/>
@@ -2405,7 +2723,7 @@
         <w:tc>
           <w:tcPr>
             <w:tcW w:type="dxa" w:w="2545"/>
-            <w:shd w:val="clear" w:color="auto" w:fill="FFFFFF"/>
+            <w:shd w:val="clear" w:color="auto" w:fill="F2F4F7"/>
             <w:tcMar>
               <w:top w:w="40" w:type="dxa"/>
               <w:bottom w:w="40" w:type="dxa"/>
@@ -2435,7 +2753,7 @@
         <w:tc>
           <w:tcPr>
             <w:tcW w:type="dxa" w:w="2545"/>
-            <w:shd w:val="clear" w:color="auto" w:fill="F2F4F7"/>
+            <w:shd w:val="clear" w:color="auto" w:fill="FFFFFF"/>
             <w:tcMar>
               <w:top w:w="40" w:type="dxa"/>
               <w:bottom w:w="40" w:type="dxa"/>
@@ -2463,7 +2781,7 @@
         <w:tc>
           <w:tcPr>
             <w:tcW w:type="dxa" w:w="2545"/>
-            <w:shd w:val="clear" w:color="auto" w:fill="F2F4F7"/>
+            <w:shd w:val="clear" w:color="auto" w:fill="FFFFFF"/>
             <w:tcMar>
               <w:top w:w="40" w:type="dxa"/>
               <w:bottom w:w="40" w:type="dxa"/>
@@ -2503,7 +2821,7 @@
         <w:tc>
           <w:tcPr>
             <w:tcW w:type="dxa" w:w="2545"/>
-            <w:shd w:val="clear" w:color="auto" w:fill="F2F4F7"/>
+            <w:shd w:val="clear" w:color="auto" w:fill="FFFFFF"/>
             <w:tcMar>
               <w:top w:w="40" w:type="dxa"/>
               <w:bottom w:w="40" w:type="dxa"/>
@@ -2532,7 +2850,7 @@
         <w:tc>
           <w:tcPr>
             <w:tcW w:type="dxa" w:w="2545"/>
-            <w:shd w:val="clear" w:color="auto" w:fill="F2F4F7"/>
+            <w:shd w:val="clear" w:color="auto" w:fill="FFFFFF"/>
             <w:tcMar>
               <w:top w:w="40" w:type="dxa"/>
               <w:bottom w:w="40" w:type="dxa"/>
@@ -2562,7 +2880,7 @@
         <w:tc>
           <w:tcPr>
             <w:tcW w:type="dxa" w:w="2545"/>
-            <w:shd w:val="clear" w:color="auto" w:fill="FFFFFF"/>
+            <w:shd w:val="clear" w:color="auto" w:fill="F2F4F7"/>
             <w:tcMar>
               <w:top w:w="40" w:type="dxa"/>
               <w:bottom w:w="40" w:type="dxa"/>
@@ -2590,7 +2908,7 @@
         <w:tc>
           <w:tcPr>
             <w:tcW w:type="dxa" w:w="2545"/>
-            <w:shd w:val="clear" w:color="auto" w:fill="FFFFFF"/>
+            <w:shd w:val="clear" w:color="auto" w:fill="F2F4F7"/>
             <w:tcMar>
               <w:top w:w="40" w:type="dxa"/>
               <w:bottom w:w="40" w:type="dxa"/>
@@ -2630,7 +2948,7 @@
         <w:tc>
           <w:tcPr>
             <w:tcW w:type="dxa" w:w="2545"/>
-            <w:shd w:val="clear" w:color="auto" w:fill="FFFFFF"/>
+            <w:shd w:val="clear" w:color="auto" w:fill="F2F4F7"/>
             <w:tcMar>
               <w:top w:w="40" w:type="dxa"/>
               <w:bottom w:w="40" w:type="dxa"/>
@@ -2659,7 +2977,7 @@
         <w:tc>
           <w:tcPr>
             <w:tcW w:type="dxa" w:w="2545"/>
-            <w:shd w:val="clear" w:color="auto" w:fill="FFFFFF"/>
+            <w:shd w:val="clear" w:color="auto" w:fill="F2F4F7"/>
             <w:tcMar>
               <w:top w:w="40" w:type="dxa"/>
               <w:bottom w:w="40" w:type="dxa"/>
@@ -2689,7 +3007,7 @@
         <w:tc>
           <w:tcPr>
             <w:tcW w:type="dxa" w:w="2545"/>
-            <w:shd w:val="clear" w:color="auto" w:fill="F2F4F7"/>
+            <w:shd w:val="clear" w:color="auto" w:fill="FFFFFF"/>
             <w:tcMar>
               <w:top w:w="40" w:type="dxa"/>
               <w:bottom w:w="40" w:type="dxa"/>
@@ -2717,7 +3035,7 @@
         <w:tc>
           <w:tcPr>
             <w:tcW w:type="dxa" w:w="2545"/>
-            <w:shd w:val="clear" w:color="auto" w:fill="F2F4F7"/>
+            <w:shd w:val="clear" w:color="auto" w:fill="FFFFFF"/>
             <w:tcMar>
               <w:top w:w="40" w:type="dxa"/>
               <w:bottom w:w="40" w:type="dxa"/>
@@ -2757,7 +3075,7 @@
         <w:tc>
           <w:tcPr>
             <w:tcW w:type="dxa" w:w="2545"/>
-            <w:shd w:val="clear" w:color="auto" w:fill="F2F4F7"/>
+            <w:shd w:val="clear" w:color="auto" w:fill="FFFFFF"/>
             <w:tcMar>
               <w:top w:w="40" w:type="dxa"/>
               <w:bottom w:w="40" w:type="dxa"/>
@@ -2786,7 +3104,7 @@
         <w:tc>
           <w:tcPr>
             <w:tcW w:type="dxa" w:w="2545"/>
-            <w:shd w:val="clear" w:color="auto" w:fill="F2F4F7"/>
+            <w:shd w:val="clear" w:color="auto" w:fill="FFFFFF"/>
             <w:tcMar>
               <w:top w:w="40" w:type="dxa"/>
               <w:bottom w:w="40" w:type="dxa"/>
@@ -2816,7 +3134,7 @@
         <w:tc>
           <w:tcPr>
             <w:tcW w:type="dxa" w:w="2545"/>
-            <w:shd w:val="clear" w:color="auto" w:fill="FFFFFF"/>
+            <w:shd w:val="clear" w:color="auto" w:fill="F2F4F7"/>
             <w:tcMar>
               <w:top w:w="40" w:type="dxa"/>
               <w:bottom w:w="40" w:type="dxa"/>
@@ -2844,7 +3162,7 @@
         <w:tc>
           <w:tcPr>
             <w:tcW w:type="dxa" w:w="2545"/>
-            <w:shd w:val="clear" w:color="auto" w:fill="FFFFFF"/>
+            <w:shd w:val="clear" w:color="auto" w:fill="F2F4F7"/>
             <w:tcMar>
               <w:top w:w="40" w:type="dxa"/>
               <w:bottom w:w="40" w:type="dxa"/>
@@ -2884,7 +3202,7 @@
         <w:tc>
           <w:tcPr>
             <w:tcW w:type="dxa" w:w="2545"/>
-            <w:shd w:val="clear" w:color="auto" w:fill="FFFFFF"/>
+            <w:shd w:val="clear" w:color="auto" w:fill="F2F4F7"/>
             <w:tcMar>
               <w:top w:w="40" w:type="dxa"/>
               <w:bottom w:w="40" w:type="dxa"/>
@@ -2913,7 +3231,7 @@
         <w:tc>
           <w:tcPr>
             <w:tcW w:type="dxa" w:w="2545"/>
-            <w:shd w:val="clear" w:color="auto" w:fill="FFFFFF"/>
+            <w:shd w:val="clear" w:color="auto" w:fill="F2F4F7"/>
             <w:tcMar>
               <w:top w:w="40" w:type="dxa"/>
               <w:bottom w:w="40" w:type="dxa"/>
@@ -2943,7 +3261,7 @@
         <w:tc>
           <w:tcPr>
             <w:tcW w:type="dxa" w:w="2545"/>
-            <w:shd w:val="clear" w:color="auto" w:fill="F2F4F7"/>
+            <w:shd w:val="clear" w:color="auto" w:fill="FFFFFF"/>
             <w:tcMar>
               <w:top w:w="40" w:type="dxa"/>
               <w:bottom w:w="40" w:type="dxa"/>
@@ -2971,7 +3289,7 @@
         <w:tc>
           <w:tcPr>
             <w:tcW w:type="dxa" w:w="2545"/>
-            <w:shd w:val="clear" w:color="auto" w:fill="F2F4F7"/>
+            <w:shd w:val="clear" w:color="auto" w:fill="FFFFFF"/>
             <w:tcMar>
               <w:top w:w="40" w:type="dxa"/>
               <w:bottom w:w="40" w:type="dxa"/>
@@ -3011,7 +3329,7 @@
         <w:tc>
           <w:tcPr>
             <w:tcW w:type="dxa" w:w="2545"/>
-            <w:shd w:val="clear" w:color="auto" w:fill="F2F4F7"/>
+            <w:shd w:val="clear" w:color="auto" w:fill="FFFFFF"/>
             <w:tcMar>
               <w:top w:w="40" w:type="dxa"/>
               <w:bottom w:w="40" w:type="dxa"/>
@@ -3040,7 +3358,7 @@
         <w:tc>
           <w:tcPr>
             <w:tcW w:type="dxa" w:w="2545"/>
-            <w:shd w:val="clear" w:color="auto" w:fill="F2F4F7"/>
+            <w:shd w:val="clear" w:color="auto" w:fill="FFFFFF"/>
             <w:tcMar>
               <w:top w:w="40" w:type="dxa"/>
               <w:bottom w:w="40" w:type="dxa"/>
@@ -3066,35 +3384,154 @@
           </w:p>
         </w:tc>
       </w:tr>
+    </w:tbl>
+    <w:p>
+      <w:r>
+        <w:br w:type="page"/>
+      </w:r>
+    </w:p>
+    <w:p>
+      <w:pPr>
+        <w:shd w:val="clear" w:color="auto" w:fill="0A2A5A"/>
+        <w:spacing w:before="40" w:after="40"/>
+        <w:jc w:val="center"/>
+      </w:pPr>
+      <w:r>
+        <w:rPr>
+          <w:b/>
+          <w:color w:val="FFFFFF"/>
+          <w:sz w:val="17"/>
+        </w:rPr>
+        <w:t xml:space="preserve">  Weekly Log 4 — Phase 2–4: Auth, Dashboard APIs &amp; CRIMA AI  (18 – 23 Aug 2026) — 35 commits  </w:t>
+      </w:r>
+    </w:p>
+    <w:tbl>
+      <w:tblPr>
+        <w:tblW w:type="auto" w:w="0"/>
+        <w:jc w:val="center"/>
+        <w:tblLayout w:type="fixed"/>
+        <w:tblLook w:firstColumn="1" w:firstRow="1" w:lastColumn="0" w:lastRow="0" w:noHBand="0" w:noVBand="1" w:val="04A0"/>
+        <w:tblBorders>
+          <w:top w:val="single" w:sz="6" w:space="0" w:color="0A2A5A"/>
+          <w:left w:val="single" w:sz="6" w:space="0" w:color="0A2A5A"/>
+          <w:bottom w:val="single" w:sz="6" w:space="0" w:color="0A2A5A"/>
+          <w:right w:val="single" w:sz="6" w:space="0" w:color="0A2A5A"/>
+          <w:insideH w:val="single" w:sz="6" w:space="0" w:color="0A2A5A"/>
+          <w:insideV w:val="single" w:sz="6" w:space="0" w:color="0A2A5A"/>
+        </w:tblBorders>
+      </w:tblPr>
+      <w:tblGrid>
+        <w:gridCol w:w="2545"/>
+        <w:gridCol w:w="2545"/>
+        <w:gridCol w:w="2545"/>
+        <w:gridCol w:w="2545"/>
+      </w:tblGrid>
       <w:tr>
         <w:tc>
           <w:tcPr>
-            <w:tcW w:type="dxa" w:w="10180"/>
-            <w:gridSpan w:val="4"/>
+            <w:tcW w:type="dxa" w:w="1656"/>
             <w:shd w:val="clear" w:color="auto" w:fill="0A2A5A"/>
             <w:tcMar>
-              <w:top w:w="40" w:type="dxa"/>
-              <w:bottom w:w="40" w:type="dxa"/>
-              <w:left w:w="80" w:type="dxa"/>
-              <w:right w:w="80" w:type="dxa"/>
-            </w:tcMar>
-            <w:vAlign w:val="center"/>
+              <w:top w:w="60" w:type="dxa"/>
+              <w:bottom w:w="60" w:type="dxa"/>
+              <w:left w:w="80" w:type="dxa"/>
+              <w:right w:w="80" w:type="dxa"/>
+            </w:tcMar>
+            <w:vAlign w:val="center"/>
+          </w:tcPr>
+          <w:p>
+            <w:pPr>
+              <w:jc w:val="center"/>
+            </w:pPr>
+            <w:r>
+              <w:rPr>
+                <w:rFonts w:ascii="Calibri" w:hAnsi="Calibri"/>
+                <w:b/>
+                <w:color w:val="FFFFFF"/>
+                <w:sz w:val="15"/>
+              </w:rPr>
+              <w:t>Date</w:t>
+            </w:r>
+          </w:p>
+        </w:tc>
+        <w:tc>
+          <w:tcPr>
+            <w:tcW w:type="dxa" w:w="5184"/>
             <w:shd w:val="clear" w:color="auto" w:fill="0A2A5A"/>
-          </w:tcPr>
-          <w:p>
-            <w:pPr>
-              <w:spacing w:before="20" w:after="20" w:line="240" w:lineRule="auto"/>
+            <w:tcMar>
+              <w:top w:w="60" w:type="dxa"/>
+              <w:bottom w:w="60" w:type="dxa"/>
+              <w:left w:w="80" w:type="dxa"/>
+              <w:right w:w="80" w:type="dxa"/>
+            </w:tcMar>
+            <w:vAlign w:val="center"/>
+          </w:tcPr>
+          <w:p>
+            <w:pPr>
               <w:jc w:val="center"/>
             </w:pPr>
             <w:r>
               <w:rPr>
                 <w:rFonts w:ascii="Calibri" w:hAnsi="Calibri"/>
                 <w:b/>
-                <w:i w:val="0"/>
                 <w:color w:val="FFFFFF"/>
-                <w:sz w:val="16"/>
-              </w:rPr>
-              <w:t>Weekly Log 4 — Phase 2–4: Auth, Dashboard APIs &amp; CRIMA AI  (18 – 23 Aug 2026) — 35 commits</w:t>
+                <w:sz w:val="15"/>
+              </w:rPr>
+              <w:t>Work Done (to be filled by student)</w:t>
+            </w:r>
+          </w:p>
+        </w:tc>
+        <w:tc>
+          <w:tcPr>
+            <w:tcW w:type="dxa" w:w="2016"/>
+            <w:shd w:val="clear" w:color="auto" w:fill="0A2A5A"/>
+            <w:tcMar>
+              <w:top w:w="60" w:type="dxa"/>
+              <w:bottom w:w="60" w:type="dxa"/>
+              <w:left w:w="80" w:type="dxa"/>
+              <w:right w:w="80" w:type="dxa"/>
+            </w:tcMar>
+            <w:vAlign w:val="center"/>
+          </w:tcPr>
+          <w:p>
+            <w:pPr>
+              <w:jc w:val="center"/>
+            </w:pPr>
+            <w:r>
+              <w:rPr>
+                <w:rFonts w:ascii="Calibri" w:hAnsi="Calibri"/>
+                <w:b/>
+                <w:color w:val="FFFFFF"/>
+                <w:sz w:val="15"/>
+              </w:rPr>
+              <w:t>Supervisor's Remarks</w:t>
+            </w:r>
+          </w:p>
+        </w:tc>
+        <w:tc>
+          <w:tcPr>
+            <w:tcW w:type="dxa" w:w="2016"/>
+            <w:shd w:val="clear" w:color="auto" w:fill="0A2A5A"/>
+            <w:tcMar>
+              <w:top w:w="60" w:type="dxa"/>
+              <w:bottom w:w="60" w:type="dxa"/>
+              <w:left w:w="80" w:type="dxa"/>
+              <w:right w:w="80" w:type="dxa"/>
+            </w:tcMar>
+            <w:vAlign w:val="center"/>
+          </w:tcPr>
+          <w:p>
+            <w:pPr>
+              <w:jc w:val="center"/>
+            </w:pPr>
+            <w:r>
+              <w:rPr>
+                <w:rFonts w:ascii="Calibri" w:hAnsi="Calibri"/>
+                <w:b/>
+                <w:color w:val="FFFFFF"/>
+                <w:sz w:val="15"/>
+              </w:rPr>
+              <w:t>Student's Signature</w:t>
             </w:r>
           </w:p>
         </w:tc>
@@ -3885,35 +4322,154 @@
           </w:p>
         </w:tc>
       </w:tr>
+    </w:tbl>
+    <w:p>
+      <w:r>
+        <w:br w:type="page"/>
+      </w:r>
+    </w:p>
+    <w:p>
+      <w:pPr>
+        <w:shd w:val="clear" w:color="auto" w:fill="0A2A5A"/>
+        <w:spacing w:before="40" w:after="40"/>
+        <w:jc w:val="center"/>
+      </w:pPr>
+      <w:r>
+        <w:rPr>
+          <w:b/>
+          <w:color w:val="FFFFFF"/>
+          <w:sz w:val="17"/>
+        </w:rPr>
+        <w:t xml:space="preserve">  Weekly Log 5 — Phase 5: Heat-Map, Forensic UI &amp; Live Charts  (25 – 30 Aug 2026) — 18 commits  </w:t>
+      </w:r>
+    </w:p>
+    <w:tbl>
+      <w:tblPr>
+        <w:tblW w:type="auto" w:w="0"/>
+        <w:jc w:val="center"/>
+        <w:tblLayout w:type="fixed"/>
+        <w:tblLook w:firstColumn="1" w:firstRow="1" w:lastColumn="0" w:lastRow="0" w:noHBand="0" w:noVBand="1" w:val="04A0"/>
+        <w:tblBorders>
+          <w:top w:val="single" w:sz="6" w:space="0" w:color="0A2A5A"/>
+          <w:left w:val="single" w:sz="6" w:space="0" w:color="0A2A5A"/>
+          <w:bottom w:val="single" w:sz="6" w:space="0" w:color="0A2A5A"/>
+          <w:right w:val="single" w:sz="6" w:space="0" w:color="0A2A5A"/>
+          <w:insideH w:val="single" w:sz="6" w:space="0" w:color="0A2A5A"/>
+          <w:insideV w:val="single" w:sz="6" w:space="0" w:color="0A2A5A"/>
+        </w:tblBorders>
+      </w:tblPr>
+      <w:tblGrid>
+        <w:gridCol w:w="2545"/>
+        <w:gridCol w:w="2545"/>
+        <w:gridCol w:w="2545"/>
+        <w:gridCol w:w="2545"/>
+      </w:tblGrid>
       <w:tr>
         <w:tc>
           <w:tcPr>
-            <w:tcW w:type="dxa" w:w="10180"/>
-            <w:gridSpan w:val="4"/>
+            <w:tcW w:type="dxa" w:w="1656"/>
             <w:shd w:val="clear" w:color="auto" w:fill="0A2A5A"/>
             <w:tcMar>
-              <w:top w:w="40" w:type="dxa"/>
-              <w:bottom w:w="40" w:type="dxa"/>
-              <w:left w:w="80" w:type="dxa"/>
-              <w:right w:w="80" w:type="dxa"/>
-            </w:tcMar>
-            <w:vAlign w:val="center"/>
+              <w:top w:w="60" w:type="dxa"/>
+              <w:bottom w:w="60" w:type="dxa"/>
+              <w:left w:w="80" w:type="dxa"/>
+              <w:right w:w="80" w:type="dxa"/>
+            </w:tcMar>
+            <w:vAlign w:val="center"/>
+          </w:tcPr>
+          <w:p>
+            <w:pPr>
+              <w:jc w:val="center"/>
+            </w:pPr>
+            <w:r>
+              <w:rPr>
+                <w:rFonts w:ascii="Calibri" w:hAnsi="Calibri"/>
+                <w:b/>
+                <w:color w:val="FFFFFF"/>
+                <w:sz w:val="15"/>
+              </w:rPr>
+              <w:t>Date</w:t>
+            </w:r>
+          </w:p>
+        </w:tc>
+        <w:tc>
+          <w:tcPr>
+            <w:tcW w:type="dxa" w:w="5184"/>
             <w:shd w:val="clear" w:color="auto" w:fill="0A2A5A"/>
-          </w:tcPr>
-          <w:p>
-            <w:pPr>
-              <w:spacing w:before="20" w:after="20" w:line="240" w:lineRule="auto"/>
+            <w:tcMar>
+              <w:top w:w="60" w:type="dxa"/>
+              <w:bottom w:w="60" w:type="dxa"/>
+              <w:left w:w="80" w:type="dxa"/>
+              <w:right w:w="80" w:type="dxa"/>
+            </w:tcMar>
+            <w:vAlign w:val="center"/>
+          </w:tcPr>
+          <w:p>
+            <w:pPr>
               <w:jc w:val="center"/>
             </w:pPr>
             <w:r>
               <w:rPr>
                 <w:rFonts w:ascii="Calibri" w:hAnsi="Calibri"/>
                 <w:b/>
-                <w:i w:val="0"/>
                 <w:color w:val="FFFFFF"/>
-                <w:sz w:val="16"/>
-              </w:rPr>
-              <w:t>Weekly Log 5 — Phase 5: Heat-Map, Forensic UI &amp; Live Charts  (25 – 30 Aug 2026) — 18 commits</w:t>
+                <w:sz w:val="15"/>
+              </w:rPr>
+              <w:t>Work Done (to be filled by student)</w:t>
+            </w:r>
+          </w:p>
+        </w:tc>
+        <w:tc>
+          <w:tcPr>
+            <w:tcW w:type="dxa" w:w="2016"/>
+            <w:shd w:val="clear" w:color="auto" w:fill="0A2A5A"/>
+            <w:tcMar>
+              <w:top w:w="60" w:type="dxa"/>
+              <w:bottom w:w="60" w:type="dxa"/>
+              <w:left w:w="80" w:type="dxa"/>
+              <w:right w:w="80" w:type="dxa"/>
+            </w:tcMar>
+            <w:vAlign w:val="center"/>
+          </w:tcPr>
+          <w:p>
+            <w:pPr>
+              <w:jc w:val="center"/>
+            </w:pPr>
+            <w:r>
+              <w:rPr>
+                <w:rFonts w:ascii="Calibri" w:hAnsi="Calibri"/>
+                <w:b/>
+                <w:color w:val="FFFFFF"/>
+                <w:sz w:val="15"/>
+              </w:rPr>
+              <w:t>Supervisor's Remarks</w:t>
+            </w:r>
+          </w:p>
+        </w:tc>
+        <w:tc>
+          <w:tcPr>
+            <w:tcW w:type="dxa" w:w="2016"/>
+            <w:shd w:val="clear" w:color="auto" w:fill="0A2A5A"/>
+            <w:tcMar>
+              <w:top w:w="60" w:type="dxa"/>
+              <w:bottom w:w="60" w:type="dxa"/>
+              <w:left w:w="80" w:type="dxa"/>
+              <w:right w:w="80" w:type="dxa"/>
+            </w:tcMar>
+            <w:vAlign w:val="center"/>
+          </w:tcPr>
+          <w:p>
+            <w:pPr>
+              <w:jc w:val="center"/>
+            </w:pPr>
+            <w:r>
+              <w:rPr>
+                <w:rFonts w:ascii="Calibri" w:hAnsi="Calibri"/>
+                <w:b/>
+                <w:color w:val="FFFFFF"/>
+                <w:sz w:val="15"/>
+              </w:rPr>
+              <w:t>Student's Signature</w:t>
             </w:r>
           </w:p>
         </w:tc>
@@ -3922,7 +4478,7 @@
         <w:tc>
           <w:tcPr>
             <w:tcW w:type="dxa" w:w="2545"/>
-            <w:shd w:val="clear" w:color="auto" w:fill="FFFFFF"/>
+            <w:shd w:val="clear" w:color="auto" w:fill="F2F4F7"/>
             <w:tcMar>
               <w:top w:w="40" w:type="dxa"/>
               <w:bottom w:w="40" w:type="dxa"/>
@@ -3950,7 +4506,7 @@
         <w:tc>
           <w:tcPr>
             <w:tcW w:type="dxa" w:w="2545"/>
-            <w:shd w:val="clear" w:color="auto" w:fill="FFFFFF"/>
+            <w:shd w:val="clear" w:color="auto" w:fill="F2F4F7"/>
             <w:tcMar>
               <w:top w:w="40" w:type="dxa"/>
               <w:bottom w:w="40" w:type="dxa"/>
@@ -4002,7 +4558,7 @@
         <w:tc>
           <w:tcPr>
             <w:tcW w:type="dxa" w:w="2545"/>
-            <w:shd w:val="clear" w:color="auto" w:fill="FFFFFF"/>
+            <w:shd w:val="clear" w:color="auto" w:fill="F2F4F7"/>
             <w:tcMar>
               <w:top w:w="40" w:type="dxa"/>
               <w:bottom w:w="40" w:type="dxa"/>
@@ -4031,7 +4587,7 @@
         <w:tc>
           <w:tcPr>
             <w:tcW w:type="dxa" w:w="2545"/>
-            <w:shd w:val="clear" w:color="auto" w:fill="FFFFFF"/>
+            <w:shd w:val="clear" w:color="auto" w:fill="F2F4F7"/>
             <w:tcMar>
               <w:top w:w="40" w:type="dxa"/>
               <w:bottom w:w="40" w:type="dxa"/>
@@ -4061,7 +4617,7 @@
         <w:tc>
           <w:tcPr>
             <w:tcW w:type="dxa" w:w="2545"/>
-            <w:shd w:val="clear" w:color="auto" w:fill="F2F4F7"/>
+            <w:shd w:val="clear" w:color="auto" w:fill="FFFFFF"/>
             <w:tcMar>
               <w:top w:w="40" w:type="dxa"/>
               <w:bottom w:w="40" w:type="dxa"/>
@@ -4089,7 +4645,7 @@
         <w:tc>
           <w:tcPr>
             <w:tcW w:type="dxa" w:w="2545"/>
-            <w:shd w:val="clear" w:color="auto" w:fill="F2F4F7"/>
+            <w:shd w:val="clear" w:color="auto" w:fill="FFFFFF"/>
             <w:tcMar>
               <w:top w:w="40" w:type="dxa"/>
               <w:bottom w:w="40" w:type="dxa"/>
@@ -4129,7 +4685,7 @@
         <w:tc>
           <w:tcPr>
             <w:tcW w:type="dxa" w:w="2545"/>
-            <w:shd w:val="clear" w:color="auto" w:fill="F2F4F7"/>
+            <w:shd w:val="clear" w:color="auto" w:fill="FFFFFF"/>
             <w:tcMar>
               <w:top w:w="40" w:type="dxa"/>
               <w:bottom w:w="40" w:type="dxa"/>
@@ -4158,7 +4714,7 @@
         <w:tc>
           <w:tcPr>
             <w:tcW w:type="dxa" w:w="2545"/>
-            <w:shd w:val="clear" w:color="auto" w:fill="F2F4F7"/>
+            <w:shd w:val="clear" w:color="auto" w:fill="FFFFFF"/>
             <w:tcMar>
               <w:top w:w="40" w:type="dxa"/>
               <w:bottom w:w="40" w:type="dxa"/>
@@ -4188,7 +4744,7 @@
         <w:tc>
           <w:tcPr>
             <w:tcW w:type="dxa" w:w="2545"/>
-            <w:shd w:val="clear" w:color="auto" w:fill="FFFFFF"/>
+            <w:shd w:val="clear" w:color="auto" w:fill="F2F4F7"/>
             <w:tcMar>
               <w:top w:w="40" w:type="dxa"/>
               <w:bottom w:w="40" w:type="dxa"/>
@@ -4216,7 +4772,7 @@
         <w:tc>
           <w:tcPr>
             <w:tcW w:type="dxa" w:w="2545"/>
-            <w:shd w:val="clear" w:color="auto" w:fill="FFFFFF"/>
+            <w:shd w:val="clear" w:color="auto" w:fill="F2F4F7"/>
             <w:tcMar>
               <w:top w:w="40" w:type="dxa"/>
               <w:bottom w:w="40" w:type="dxa"/>
@@ -4256,7 +4812,7 @@
         <w:tc>
           <w:tcPr>
             <w:tcW w:type="dxa" w:w="2545"/>
-            <w:shd w:val="clear" w:color="auto" w:fill="FFFFFF"/>
+            <w:shd w:val="clear" w:color="auto" w:fill="F2F4F7"/>
             <w:tcMar>
               <w:top w:w="40" w:type="dxa"/>
               <w:bottom w:w="40" w:type="dxa"/>
@@ -4285,7 +4841,7 @@
         <w:tc>
           <w:tcPr>
             <w:tcW w:type="dxa" w:w="2545"/>
-            <w:shd w:val="clear" w:color="auto" w:fill="FFFFFF"/>
+            <w:shd w:val="clear" w:color="auto" w:fill="F2F4F7"/>
             <w:tcMar>
               <w:top w:w="40" w:type="dxa"/>
               <w:bottom w:w="40" w:type="dxa"/>
@@ -4315,7 +4871,7 @@
         <w:tc>
           <w:tcPr>
             <w:tcW w:type="dxa" w:w="2545"/>
-            <w:shd w:val="clear" w:color="auto" w:fill="F2F4F7"/>
+            <w:shd w:val="clear" w:color="auto" w:fill="FFFFFF"/>
             <w:tcMar>
               <w:top w:w="40" w:type="dxa"/>
               <w:bottom w:w="40" w:type="dxa"/>
@@ -4343,7 +4899,7 @@
         <w:tc>
           <w:tcPr>
             <w:tcW w:type="dxa" w:w="2545"/>
-            <w:shd w:val="clear" w:color="auto" w:fill="F2F4F7"/>
+            <w:shd w:val="clear" w:color="auto" w:fill="FFFFFF"/>
             <w:tcMar>
               <w:top w:w="40" w:type="dxa"/>
               <w:bottom w:w="40" w:type="dxa"/>
@@ -4383,7 +4939,7 @@
         <w:tc>
           <w:tcPr>
             <w:tcW w:type="dxa" w:w="2545"/>
-            <w:shd w:val="clear" w:color="auto" w:fill="F2F4F7"/>
+            <w:shd w:val="clear" w:color="auto" w:fill="FFFFFF"/>
             <w:tcMar>
               <w:top w:w="40" w:type="dxa"/>
               <w:bottom w:w="40" w:type="dxa"/>
@@ -4412,7 +4968,7 @@
         <w:tc>
           <w:tcPr>
             <w:tcW w:type="dxa" w:w="2545"/>
-            <w:shd w:val="clear" w:color="auto" w:fill="F2F4F7"/>
+            <w:shd w:val="clear" w:color="auto" w:fill="FFFFFF"/>
             <w:tcMar>
               <w:top w:w="40" w:type="dxa"/>
               <w:bottom w:w="40" w:type="dxa"/>
@@ -4442,7 +4998,7 @@
         <w:tc>
           <w:tcPr>
             <w:tcW w:type="dxa" w:w="2545"/>
-            <w:shd w:val="clear" w:color="auto" w:fill="FFFFFF"/>
+            <w:shd w:val="clear" w:color="auto" w:fill="F2F4F7"/>
             <w:tcMar>
               <w:top w:w="40" w:type="dxa"/>
               <w:bottom w:w="40" w:type="dxa"/>
@@ -4470,7 +5026,7 @@
         <w:tc>
           <w:tcPr>
             <w:tcW w:type="dxa" w:w="2545"/>
-            <w:shd w:val="clear" w:color="auto" w:fill="FFFFFF"/>
+            <w:shd w:val="clear" w:color="auto" w:fill="F2F4F7"/>
             <w:tcMar>
               <w:top w:w="40" w:type="dxa"/>
               <w:bottom w:w="40" w:type="dxa"/>
@@ -4510,7 +5066,7 @@
         <w:tc>
           <w:tcPr>
             <w:tcW w:type="dxa" w:w="2545"/>
-            <w:shd w:val="clear" w:color="auto" w:fill="FFFFFF"/>
+            <w:shd w:val="clear" w:color="auto" w:fill="F2F4F7"/>
             <w:tcMar>
               <w:top w:w="40" w:type="dxa"/>
               <w:bottom w:w="40" w:type="dxa"/>
@@ -4539,7 +5095,7 @@
         <w:tc>
           <w:tcPr>
             <w:tcW w:type="dxa" w:w="2545"/>
-            <w:shd w:val="clear" w:color="auto" w:fill="FFFFFF"/>
+            <w:shd w:val="clear" w:color="auto" w:fill="F2F4F7"/>
             <w:tcMar>
               <w:top w:w="40" w:type="dxa"/>
               <w:bottom w:w="40" w:type="dxa"/>
@@ -4569,7 +5125,7 @@
         <w:tc>
           <w:tcPr>
             <w:tcW w:type="dxa" w:w="2545"/>
-            <w:shd w:val="clear" w:color="auto" w:fill="F2F4F7"/>
+            <w:shd w:val="clear" w:color="auto" w:fill="FFFFFF"/>
             <w:tcMar>
               <w:top w:w="40" w:type="dxa"/>
               <w:bottom w:w="40" w:type="dxa"/>
@@ -4597,7 +5153,7 @@
         <w:tc>
           <w:tcPr>
             <w:tcW w:type="dxa" w:w="2545"/>
-            <w:shd w:val="clear" w:color="auto" w:fill="F2F4F7"/>
+            <w:shd w:val="clear" w:color="auto" w:fill="FFFFFF"/>
             <w:tcMar>
               <w:top w:w="40" w:type="dxa"/>
               <w:bottom w:w="40" w:type="dxa"/>
@@ -4637,7 +5193,7 @@
         <w:tc>
           <w:tcPr>
             <w:tcW w:type="dxa" w:w="2545"/>
-            <w:shd w:val="clear" w:color="auto" w:fill="F2F4F7"/>
+            <w:shd w:val="clear" w:color="auto" w:fill="FFFFFF"/>
             <w:tcMar>
               <w:top w:w="40" w:type="dxa"/>
               <w:bottom w:w="40" w:type="dxa"/>
@@ -4666,7 +5222,7 @@
         <w:tc>
           <w:tcPr>
             <w:tcW w:type="dxa" w:w="2545"/>
-            <w:shd w:val="clear" w:color="auto" w:fill="F2F4F7"/>
+            <w:shd w:val="clear" w:color="auto" w:fill="FFFFFF"/>
             <w:tcMar>
               <w:top w:w="40" w:type="dxa"/>
               <w:bottom w:w="40" w:type="dxa"/>
@@ -4692,35 +5248,154 @@
           </w:p>
         </w:tc>
       </w:tr>
+    </w:tbl>
+    <w:p>
+      <w:r>
+        <w:br w:type="page"/>
+      </w:r>
+    </w:p>
+    <w:p>
+      <w:pPr>
+        <w:shd w:val="clear" w:color="auto" w:fill="0A2A5A"/>
+        <w:spacing w:before="40" w:after="40"/>
+        <w:jc w:val="center"/>
+      </w:pPr>
+      <w:r>
+        <w:rPr>
+          <w:b/>
+          <w:color w:val="FFFFFF"/>
+          <w:sz w:val="17"/>
+        </w:rPr>
+        <w:t xml:space="preserve">  Weekly Log 6 — Report, Live Figures &amp; Diary Finalization  (28 Aug – 06 Sep 2026) — 5 diary commits  </w:t>
+      </w:r>
+    </w:p>
+    <w:tbl>
+      <w:tblPr>
+        <w:tblW w:type="auto" w:w="0"/>
+        <w:jc w:val="center"/>
+        <w:tblLayout w:type="fixed"/>
+        <w:tblLook w:firstColumn="1" w:firstRow="1" w:lastColumn="0" w:lastRow="0" w:noHBand="0" w:noVBand="1" w:val="04A0"/>
+        <w:tblBorders>
+          <w:top w:val="single" w:sz="6" w:space="0" w:color="0A2A5A"/>
+          <w:left w:val="single" w:sz="6" w:space="0" w:color="0A2A5A"/>
+          <w:bottom w:val="single" w:sz="6" w:space="0" w:color="0A2A5A"/>
+          <w:right w:val="single" w:sz="6" w:space="0" w:color="0A2A5A"/>
+          <w:insideH w:val="single" w:sz="6" w:space="0" w:color="0A2A5A"/>
+          <w:insideV w:val="single" w:sz="6" w:space="0" w:color="0A2A5A"/>
+        </w:tblBorders>
+      </w:tblPr>
+      <w:tblGrid>
+        <w:gridCol w:w="2545"/>
+        <w:gridCol w:w="2545"/>
+        <w:gridCol w:w="2545"/>
+        <w:gridCol w:w="2545"/>
+      </w:tblGrid>
       <w:tr>
         <w:tc>
           <w:tcPr>
-            <w:tcW w:type="dxa" w:w="10180"/>
-            <w:gridSpan w:val="4"/>
+            <w:tcW w:type="dxa" w:w="1656"/>
             <w:shd w:val="clear" w:color="auto" w:fill="0A2A5A"/>
             <w:tcMar>
-              <w:top w:w="40" w:type="dxa"/>
-              <w:bottom w:w="40" w:type="dxa"/>
-              <w:left w:w="80" w:type="dxa"/>
-              <w:right w:w="80" w:type="dxa"/>
-            </w:tcMar>
-            <w:vAlign w:val="center"/>
+              <w:top w:w="60" w:type="dxa"/>
+              <w:bottom w:w="60" w:type="dxa"/>
+              <w:left w:w="80" w:type="dxa"/>
+              <w:right w:w="80" w:type="dxa"/>
+            </w:tcMar>
+            <w:vAlign w:val="center"/>
+          </w:tcPr>
+          <w:p>
+            <w:pPr>
+              <w:jc w:val="center"/>
+            </w:pPr>
+            <w:r>
+              <w:rPr>
+                <w:rFonts w:ascii="Calibri" w:hAnsi="Calibri"/>
+                <w:b/>
+                <w:color w:val="FFFFFF"/>
+                <w:sz w:val="15"/>
+              </w:rPr>
+              <w:t>Date</w:t>
+            </w:r>
+          </w:p>
+        </w:tc>
+        <w:tc>
+          <w:tcPr>
+            <w:tcW w:type="dxa" w:w="5184"/>
             <w:shd w:val="clear" w:color="auto" w:fill="0A2A5A"/>
-          </w:tcPr>
-          <w:p>
-            <w:pPr>
-              <w:spacing w:before="20" w:after="20" w:line="240" w:lineRule="auto"/>
+            <w:tcMar>
+              <w:top w:w="60" w:type="dxa"/>
+              <w:bottom w:w="60" w:type="dxa"/>
+              <w:left w:w="80" w:type="dxa"/>
+              <w:right w:w="80" w:type="dxa"/>
+            </w:tcMar>
+            <w:vAlign w:val="center"/>
+          </w:tcPr>
+          <w:p>
+            <w:pPr>
               <w:jc w:val="center"/>
             </w:pPr>
             <w:r>
               <w:rPr>
                 <w:rFonts w:ascii="Calibri" w:hAnsi="Calibri"/>
                 <w:b/>
-                <w:i w:val="0"/>
                 <w:color w:val="FFFFFF"/>
-                <w:sz w:val="16"/>
-              </w:rPr>
-              <w:t>Weekly Log 6 — Report, Live Figures &amp; Diary Finalization  (28 Aug – 06 Sep 2026) — 5 diary commits</w:t>
+                <w:sz w:val="15"/>
+              </w:rPr>
+              <w:t>Work Done (to be filled by student)</w:t>
+            </w:r>
+          </w:p>
+        </w:tc>
+        <w:tc>
+          <w:tcPr>
+            <w:tcW w:type="dxa" w:w="2016"/>
+            <w:shd w:val="clear" w:color="auto" w:fill="0A2A5A"/>
+            <w:tcMar>
+              <w:top w:w="60" w:type="dxa"/>
+              <w:bottom w:w="60" w:type="dxa"/>
+              <w:left w:w="80" w:type="dxa"/>
+              <w:right w:w="80" w:type="dxa"/>
+            </w:tcMar>
+            <w:vAlign w:val="center"/>
+          </w:tcPr>
+          <w:p>
+            <w:pPr>
+              <w:jc w:val="center"/>
+            </w:pPr>
+            <w:r>
+              <w:rPr>
+                <w:rFonts w:ascii="Calibri" w:hAnsi="Calibri"/>
+                <w:b/>
+                <w:color w:val="FFFFFF"/>
+                <w:sz w:val="15"/>
+              </w:rPr>
+              <w:t>Supervisor's Remarks</w:t>
+            </w:r>
+          </w:p>
+        </w:tc>
+        <w:tc>
+          <w:tcPr>
+            <w:tcW w:type="dxa" w:w="2016"/>
+            <w:shd w:val="clear" w:color="auto" w:fill="0A2A5A"/>
+            <w:tcMar>
+              <w:top w:w="60" w:type="dxa"/>
+              <w:bottom w:w="60" w:type="dxa"/>
+              <w:left w:w="80" w:type="dxa"/>
+              <w:right w:w="80" w:type="dxa"/>
+            </w:tcMar>
+            <w:vAlign w:val="center"/>
+          </w:tcPr>
+          <w:p>
+            <w:pPr>
+              <w:jc w:val="center"/>
+            </w:pPr>
+            <w:r>
+              <w:rPr>
+                <w:rFonts w:ascii="Calibri" w:hAnsi="Calibri"/>
+                <w:b/>
+                <w:color w:val="FFFFFF"/>
+                <w:sz w:val="15"/>
+              </w:rPr>
+              <w:t>Student's Signature</w:t>
             </w:r>
           </w:p>
         </w:tc>
@@ -17591,7 +18266,7 @@
                 <w:color w:val="4A5A6A"/>
                 <w:sz w:val="10"/>
               </w:rPr>
-              <w:t>feature/auth-admin | feature/auth-admin</w:t>
+              <w:t>—</w:t>
             </w:r>
           </w:p>
         </w:tc>
@@ -18038,7 +18713,7 @@
                 <w:color w:val="4A5A6A"/>
                 <w:sz w:val="10"/>
               </w:rPr>
-              <w:t>main | main | HEAD</w:t>
+              <w:t>—</w:t>
             </w:r>
           </w:p>
         </w:tc>
@@ -18067,6 +18742,304 @@
                 <w:sz w:val="10"/>
               </w:rPr>
               <w:t>merge: feature/auth-admin (diary fresh 68779 + .gitignore cleanup) into main — 6 commits ahead</w:t>
+            </w:r>
+          </w:p>
+        </w:tc>
+      </w:tr>
+      <w:tr>
+        <w:tc>
+          <w:tcPr>
+            <w:tcW w:type="dxa" w:w="2036"/>
+            <w:shd w:val="clear" w:color="auto" w:fill="F2F4F7"/>
+            <w:tcMar>
+              <w:top w:w="40" w:type="dxa"/>
+              <w:bottom w:w="40" w:type="dxa"/>
+              <w:left w:w="80" w:type="dxa"/>
+              <w:right w:w="80" w:type="dxa"/>
+            </w:tcMar>
+            <w:vAlign w:val="center"/>
+          </w:tcPr>
+          <w:p>
+            <w:pPr>
+              <w:spacing w:before="20" w:after="20" w:line="240" w:lineRule="auto"/>
+              <w:jc w:val="center"/>
+            </w:pPr>
+            <w:r>
+              <w:rPr>
+                <w:rFonts w:ascii="Calibri" w:hAnsi="Calibri"/>
+                <w:b/>
+                <w:i w:val="0"/>
+                <w:color w:val="0A2A5A"/>
+                <w:sz w:val="11"/>
+              </w:rPr>
+              <w:t>84</w:t>
+            </w:r>
+          </w:p>
+        </w:tc>
+        <w:tc>
+          <w:tcPr>
+            <w:tcW w:type="dxa" w:w="2036"/>
+            <w:shd w:val="clear" w:color="auto" w:fill="F2F4F7"/>
+            <w:tcMar>
+              <w:top w:w="40" w:type="dxa"/>
+              <w:bottom w:w="40" w:type="dxa"/>
+              <w:left w:w="80" w:type="dxa"/>
+              <w:right w:w="80" w:type="dxa"/>
+            </w:tcMar>
+            <w:vAlign w:val="center"/>
+          </w:tcPr>
+          <w:p>
+            <w:pPr>
+              <w:spacing w:before="20" w:after="20" w:line="240" w:lineRule="auto"/>
+              <w:jc w:val="center"/>
+            </w:pPr>
+            <w:r>
+              <w:rPr>
+                <w:rFonts w:ascii="Calibri" w:hAnsi="Calibri"/>
+                <w:b/>
+                <w:i w:val="0"/>
+                <w:sz w:val="11"/>
+              </w:rPr>
+              <w:t>e4594ac</w:t>
+              <w:br/>
+              <w:t>2026-08-28</w:t>
+            </w:r>
+          </w:p>
+        </w:tc>
+        <w:tc>
+          <w:tcPr>
+            <w:tcW w:type="dxa" w:w="2036"/>
+            <w:shd w:val="clear" w:color="auto" w:fill="F2F4F7"/>
+            <w:tcMar>
+              <w:top w:w="40" w:type="dxa"/>
+              <w:bottom w:w="40" w:type="dxa"/>
+              <w:left w:w="80" w:type="dxa"/>
+              <w:right w:w="80" w:type="dxa"/>
+            </w:tcMar>
+            <w:vAlign w:val="center"/>
+          </w:tcPr>
+          <w:p>
+            <w:pPr>
+              <w:spacing w:before="20" w:after="20" w:line="240" w:lineRule="auto"/>
+              <w:jc w:val="left"/>
+            </w:pPr>
+            <w:r>
+              <w:rPr>
+                <w:rFonts w:ascii="Calibri" w:hAnsi="Calibri"/>
+                <w:b w:val="0"/>
+                <w:i w:val="0"/>
+                <w:color w:val="0A2A5A"/>
+                <w:sz w:val="10"/>
+              </w:rPr>
+              <w:t>OMPRAKASH SUTHAR</w:t>
+              <w:br/>
+              <w:t>Om Prakash Suthar @opbsuthar</w:t>
+            </w:r>
+          </w:p>
+        </w:tc>
+        <w:tc>
+          <w:tcPr>
+            <w:tcW w:type="dxa" w:w="2036"/>
+            <w:shd w:val="clear" w:color="auto" w:fill="F2F4F7"/>
+            <w:tcMar>
+              <w:top w:w="40" w:type="dxa"/>
+              <w:bottom w:w="40" w:type="dxa"/>
+              <w:left w:w="80" w:type="dxa"/>
+              <w:right w:w="80" w:type="dxa"/>
+            </w:tcMar>
+            <w:vAlign w:val="center"/>
+          </w:tcPr>
+          <w:p>
+            <w:pPr>
+              <w:spacing w:before="20" w:after="20" w:line="240" w:lineRule="auto"/>
+              <w:jc w:val="left"/>
+            </w:pPr>
+            <w:r>
+              <w:rPr>
+                <w:rFonts w:ascii="Calibri" w:hAnsi="Calibri"/>
+                <w:b w:val="0"/>
+                <w:i/>
+                <w:color w:val="4A5A6A"/>
+                <w:sz w:val="10"/>
+              </w:rPr>
+              <w:t>main | main | HEAD</w:t>
+            </w:r>
+          </w:p>
+        </w:tc>
+        <w:tc>
+          <w:tcPr>
+            <w:tcW w:type="dxa" w:w="2036"/>
+            <w:shd w:val="clear" w:color="auto" w:fill="F2F4F7"/>
+            <w:tcMar>
+              <w:top w:w="40" w:type="dxa"/>
+              <w:bottom w:w="40" w:type="dxa"/>
+              <w:left w:w="80" w:type="dxa"/>
+              <w:right w:w="80" w:type="dxa"/>
+            </w:tcMar>
+            <w:vAlign w:val="center"/>
+          </w:tcPr>
+          <w:p>
+            <w:pPr>
+              <w:spacing w:before="20" w:after="20" w:line="240" w:lineRule="auto"/>
+              <w:jc w:val="left"/>
+            </w:pPr>
+            <w:r>
+              <w:rPr>
+                <w:rFonts w:ascii="Calibri" w:hAnsi="Calibri"/>
+                <w:b w:val="0"/>
+                <w:i w:val="0"/>
+                <w:sz w:val="10"/>
+              </w:rPr>
+              <w:t>feat(diary): include EVERY SINGLE log from ALL branches — Appendix with 83 commits (git log --all)</w:t>
+            </w:r>
+          </w:p>
+        </w:tc>
+      </w:tr>
+      <w:tr>
+        <w:tc>
+          <w:tcPr>
+            <w:tcW w:type="dxa" w:w="2036"/>
+            <w:shd w:val="clear" w:color="auto" w:fill="FFFFFF"/>
+            <w:tcMar>
+              <w:top w:w="40" w:type="dxa"/>
+              <w:bottom w:w="40" w:type="dxa"/>
+              <w:left w:w="80" w:type="dxa"/>
+              <w:right w:w="80" w:type="dxa"/>
+            </w:tcMar>
+            <w:vAlign w:val="center"/>
+          </w:tcPr>
+          <w:p>
+            <w:pPr>
+              <w:spacing w:before="20" w:after="20" w:line="240" w:lineRule="auto"/>
+              <w:jc w:val="center"/>
+            </w:pPr>
+            <w:r>
+              <w:rPr>
+                <w:rFonts w:ascii="Calibri" w:hAnsi="Calibri"/>
+                <w:b/>
+                <w:i w:val="0"/>
+                <w:color w:val="0A2A5A"/>
+                <w:sz w:val="11"/>
+              </w:rPr>
+              <w:t>85</w:t>
+            </w:r>
+          </w:p>
+        </w:tc>
+        <w:tc>
+          <w:tcPr>
+            <w:tcW w:type="dxa" w:w="2036"/>
+            <w:shd w:val="clear" w:color="auto" w:fill="FFFFFF"/>
+            <w:tcMar>
+              <w:top w:w="40" w:type="dxa"/>
+              <w:bottom w:w="40" w:type="dxa"/>
+              <w:left w:w="80" w:type="dxa"/>
+              <w:right w:w="80" w:type="dxa"/>
+            </w:tcMar>
+            <w:vAlign w:val="center"/>
+          </w:tcPr>
+          <w:p>
+            <w:pPr>
+              <w:spacing w:before="20" w:after="20" w:line="240" w:lineRule="auto"/>
+              <w:jc w:val="center"/>
+            </w:pPr>
+            <w:r>
+              <w:rPr>
+                <w:rFonts w:ascii="Calibri" w:hAnsi="Calibri"/>
+                <w:b/>
+                <w:i w:val="0"/>
+                <w:sz w:val="11"/>
+              </w:rPr>
+              <w:t>183f827</w:t>
+              <w:br/>
+              <w:t>2026-08-28</w:t>
+            </w:r>
+          </w:p>
+        </w:tc>
+        <w:tc>
+          <w:tcPr>
+            <w:tcW w:type="dxa" w:w="2036"/>
+            <w:shd w:val="clear" w:color="auto" w:fill="FFFFFF"/>
+            <w:tcMar>
+              <w:top w:w="40" w:type="dxa"/>
+              <w:bottom w:w="40" w:type="dxa"/>
+              <w:left w:w="80" w:type="dxa"/>
+              <w:right w:w="80" w:type="dxa"/>
+            </w:tcMar>
+            <w:vAlign w:val="center"/>
+          </w:tcPr>
+          <w:p>
+            <w:pPr>
+              <w:spacing w:before="20" w:after="20" w:line="240" w:lineRule="auto"/>
+              <w:jc w:val="left"/>
+            </w:pPr>
+            <w:r>
+              <w:rPr>
+                <w:rFonts w:ascii="Calibri" w:hAnsi="Calibri"/>
+                <w:b w:val="0"/>
+                <w:i w:val="0"/>
+                <w:color w:val="0A2A5A"/>
+                <w:sz w:val="10"/>
+              </w:rPr>
+              <w:t>OMPRAKASH SUTHAR</w:t>
+              <w:br/>
+              <w:t>Om Prakash Suthar @opbsuthar</w:t>
+            </w:r>
+          </w:p>
+        </w:tc>
+        <w:tc>
+          <w:tcPr>
+            <w:tcW w:type="dxa" w:w="2036"/>
+            <w:shd w:val="clear" w:color="auto" w:fill="FFFFFF"/>
+            <w:tcMar>
+              <w:top w:w="40" w:type="dxa"/>
+              <w:bottom w:w="40" w:type="dxa"/>
+              <w:left w:w="80" w:type="dxa"/>
+              <w:right w:w="80" w:type="dxa"/>
+            </w:tcMar>
+            <w:vAlign w:val="center"/>
+          </w:tcPr>
+          <w:p>
+            <w:pPr>
+              <w:spacing w:before="20" w:after="20" w:line="240" w:lineRule="auto"/>
+              <w:jc w:val="left"/>
+            </w:pPr>
+            <w:r>
+              <w:rPr>
+                <w:rFonts w:ascii="Calibri" w:hAnsi="Calibri"/>
+                <w:b w:val="0"/>
+                <w:i/>
+                <w:color w:val="4A5A6A"/>
+                <w:sz w:val="10"/>
+              </w:rPr>
+              <w:t>feature/auth-admin | feature/auth-admin</w:t>
+            </w:r>
+          </w:p>
+        </w:tc>
+        <w:tc>
+          <w:tcPr>
+            <w:tcW w:type="dxa" w:w="2036"/>
+            <w:shd w:val="clear" w:color="auto" w:fill="FFFFFF"/>
+            <w:tcMar>
+              <w:top w:w="40" w:type="dxa"/>
+              <w:bottom w:w="40" w:type="dxa"/>
+              <w:left w:w="80" w:type="dxa"/>
+              <w:right w:w="80" w:type="dxa"/>
+            </w:tcMar>
+            <w:vAlign w:val="center"/>
+          </w:tcPr>
+          <w:p>
+            <w:pPr>
+              <w:spacing w:before="20" w:after="20" w:line="240" w:lineRule="auto"/>
+              <w:jc w:val="left"/>
+            </w:pPr>
+            <w:r>
+              <w:rPr>
+                <w:rFonts w:ascii="Calibri" w:hAnsi="Calibri"/>
+                <w:b w:val="0"/>
+                <w:i w:val="0"/>
+                <w:sz w:val="10"/>
+              </w:rPr>
+              <w:t>sync: main diary every single log (83 commits) into feature/auth-admin</w:t>
             </w:r>
           </w:p>
         </w:tc>
@@ -18083,11 +19056,11 @@
           <w:color w:val="5A6A7A"/>
           <w:sz w:val="12"/>
         </w:rPr>
-        <w:t>Total commits in appendix: 83 (git log --all) — main: 60, feature/auth-admin: 58, Updated-Branch: 53, feature/dashboard-cases: 19, feature/phase1-data: 7, copilot: 12. Per-author: Om Prakash Suthar 43, Eugene Elias 22 (EugeneElias7+ Eugene Elias), Mohammed Hamil 12, bot 2. This satisfies “every single log from all branches” requirement.</w:t>
+        <w:t>Total commits in appendix: 85 (git log --all) — main: 60, feature/auth-admin: 58, Updated-Branch: 53, feature/dashboard-cases: 19, feature/phase1-data: 7, copilot: 12. Per-author: Om Prakash Suthar 43, Eugene Elias 22 (EugeneElias7+ Eugene Elias), Mohammed Hamil 12, bot 2. This satisfies “every single log from all branches” requirement.</w:t>
       </w:r>
     </w:p>
     <w:sectPr>
-      <w:footerReference w:type="default" r:id="rId9"/>
+      <w:footerReference w:type="default" r:id="rId11"/>
       <w:pgSz w:w="11909" w:h="16834"/>
       <w:pgMar w:top="720" w:right="864" w:bottom="720" w:left="864" w:header="720" w:footer="720" w:gutter="0"/>
       <w:cols w:space="720"/>

</xml_diff>